<commit_message>
Housekeeping: validate --specs note, ADR v0.2 docx synced with ADR-011 decision, status 2026-10-09
Co-Authored-By: Claude Sonnet 5.5 <noreply@anthropic.com>
</commit_message>
<xml_diff>
--- a/docs/Fase 1. Discover/Paperdrop_ADR_v0.2_EN.docx
+++ b/docs/Fase 1. Discover/Paperdrop_ADR_v0.2_EN.docx
@@ -2147,7 +2147,7 @@
                 <w:b w:val="false"/>
                 <w:bCs w:val="false"/>
               </w:rPr>
-              <w:t xml:space="preserve">Proposed — positional extraction now required</w:t>
+              <w:t xml:space="preserve">Accepted for Android (pdfrx) — 2026-10-07</w:t>
             </w:r>
           </w:p>
         </w:tc>
@@ -4599,7 +4599,7 @@
         <w:t xml:space="preserve">Status: </w:t>
       </w:r>
       <w:r>
-        <w:t xml:space="preserve">Proposed — positional extraction now a hard acceptance criterion</w:t>
+        <w:t xml:space="preserve">Accepted for Android on 2026-10-07 — pdfrx (PDFium). The iOS part of the proposal (PDFKit) is unchanged and belongs to R2.</w:t>
       </w:r>
     </w:p>
     <w:p>
@@ -4675,6 +4675,21 @@
       </w:r>
       <w:r>
         <w:t xml:space="preserve">Confirmation of the proposal, a run over the sample-invoice corpus specifically exercising the label-value association rule above, and a check that the resulting increase in application size is acceptable.</w:t>
+      </w:r>
+    </w:p>
+    <w:p>
+      <w:pPr>
+        <w:spacing w:after="160"/>
+      </w:pPr>
+      <w:r>
+        <w:rPr>
+          <w:b/>
+          <w:bCs/>
+        </w:rPr>
+        <w:t xml:space="preserve">Decision (2026-10-07, product owner). </w:t>
+      </w:r>
+      <w:r>
+        <w:t xml:space="preserve">On Android the library is pdfrx (PDFium), not PdfBox-Android. The record was closed on this evidence, run over the PDF half of the private sample corpus (6 invoices and 2 synthetic documents) and reported as numbers only in validation/reviews/adr-011-2026-10-07.md: against the pdfplumber reference, pdfrx returns words with boxes (91 % word recall, 76 % of boxes with IoU of at least 0.5), whereas the PdfBox-Android channel as built returned text runs with spaces inside them (69.6 % of its tokens), so it could not feed the label–value rule; the label of the total bound the confirmed total in 5 of 6 invoices with pdfrx (in the sixth the label was missing from the dictionary, DEC-014) against 1 of 6; reading never modified an input file (16 of 16 hashes unchanged); the measured increase in the release arm64 package was 6.04 MB for PdfBox-Android and 6.43 MB for pdfrx over a base of 18.0 MB. **Caveats:** the run was on an Android emulator, so per-page timings are not those of a phone and are still to be taken on the Galaxy S22; six invoices are few; PdfBox-Android's figures describe how its channel was built and not necessarily the library's ceiling. **Consequences:** pdfrx is MIT, but the PDFium binary it downloads at build time is BSD-3-Clause with 19 bundled third-party licences that do not ship in the package by themselves, so the application registers those notices itself; no AGPL or GPL component is introduced. GAP-002 is closed. The adapter sits behind PdfTextSource over the shared PositionedWord and TextPage types.</w:t>
       </w:r>
     </w:p>
     <w:p>

</xml_diff>